<commit_message>
Correct HMRC process: sandbox ID only, no Production yet
Document checklist+logs gate, full operational in-year bar, March 2026 roadmap notes, forget prior-product noise. Sandbox app e6751be5-fd22-4447-9e77-aa51729b1b46 on checklist and Railway.
</commit_message>
<xml_diff>
--- a/docs/hmrc/Spreadsheet-Tax-Production-Approvals-Checklist-FILLED.docx
+++ b/docs/hmrc/Spreadsheet-Tax-Production-Approvals-Checklist-FILLED.docx
@@ -7,7 +7,7 @@
         <w:rPr>
           <w:b/>
         </w:rPr>
-        <w:t>SPREADSHEET TAX — COMPLETED ANSWERS (In-Year product / iterative: In-Year stage). Completed by Lee Hine · 2026-07-17. Prior June 2026 evidence (QuarterLink / NINO TZ222092B / ref 2026-EPI962) is a different product name. This return is for Spreadsheet Tax: https://spreadsheet-tax-production.up.railway.app</w:t>
+        <w:t>SPREADSHEET TAX — WORKING CHECKLIST (NOT READY TO SUBMIT TO SDSTEAM YET). Updated 2026-07-17 by Lee Hine. Build type target: In-Year only. Production application: NOT CREATED. Do not email SDSTeam until software is fully operational for in-year quarterly updates and sandbox logs exist.</w:t>
       </w:r>
     </w:p>
     <w:p>
@@ -3435,7 +3435,7 @@
     <w:p/>
     <w:p>
       <w:r>
-        <w:t>=== SPREADSHEET TAX ANSWER SHEET (for SDSTeam) ===</w:t>
+        <w:t>=== HEADER FIELDS ===</w:t>
       </w:r>
     </w:p>
     <w:p>
@@ -3443,10 +3443,10 @@
         <w:rPr>
           <w:b/>
         </w:rPr>
-        <w:t>Company name:</w:t>
-      </w:r>
-      <w:r>
-        <w:t xml:space="preserve"> Lee Hine (Spreadsheet Tax)</w:t>
+        <w:t xml:space="preserve">Company name: </w:t>
+      </w:r>
+      <w:r>
+        <w:t>Lee Hine (Spreadsheet Tax)</w:t>
       </w:r>
     </w:p>
     <w:p>
@@ -3454,10 +3454,10 @@
         <w:rPr>
           <w:b/>
         </w:rPr>
-        <w:t>Application name:</w:t>
-      </w:r>
-      <w:r>
-        <w:t xml:space="preserve"> Spreadsheet Tax</w:t>
+        <w:t xml:space="preserve">Application name: </w:t>
+      </w:r>
+      <w:r>
+        <w:t>Spreadsheet Tax</w:t>
       </w:r>
     </w:p>
     <w:p>
@@ -3465,10 +3465,10 @@
         <w:rPr>
           <w:b/>
         </w:rPr>
-        <w:t>Sandbox ID:</w:t>
-      </w:r>
-      <w:r>
-        <w:t xml:space="preserve"> [PASTE FROM HMRC DEVELOPER HUB — Sandbox application]</w:t>
+        <w:t xml:space="preserve">Sandbox ID (used for testing): </w:t>
+      </w:r>
+      <w:r>
+        <w:t>e6751be5-fd22-4447-9e77-aa51729b1b46</w:t>
       </w:r>
     </w:p>
     <w:p>
@@ -3476,10 +3476,10 @@
         <w:rPr>
           <w:b/>
         </w:rPr>
-        <w:t>Production Application ID:</w:t>
-      </w:r>
-      <w:r>
-        <w:t xml:space="preserve"> [PASTE FROM HUB — create Production app if missing]</w:t>
+        <w:t xml:space="preserve">Production Application ID: </w:t>
+      </w:r>
+      <w:r>
+        <w:t>NOT APPLIED FOR — do not invent. Create only when operational + ready for checklist send.</w:t>
       </w:r>
     </w:p>
     <w:p>
@@ -3487,10 +3487,10 @@
         <w:rPr>
           <w:b/>
         </w:rPr>
-        <w:t>Company website URL:</w:t>
-      </w:r>
-      <w:r>
-        <w:t xml:space="preserve"> https://spreadsheet-tax-production.up.railway.app</w:t>
+        <w:t xml:space="preserve">Company website URL: </w:t>
+      </w:r>
+      <w:r>
+        <w:t>https://spreadsheet-tax-production.up.railway.app</w:t>
       </w:r>
     </w:p>
     <w:p>
@@ -3498,10 +3498,10 @@
         <w:rPr>
           <w:b/>
         </w:rPr>
-        <w:t>Privacy:</w:t>
-      </w:r>
-      <w:r>
-        <w:t xml:space="preserve"> https://spreadsheet-tax-production.up.railway.app/privacy</w:t>
+        <w:t xml:space="preserve">Privacy / Terms / Redirect: </w:t>
+      </w:r>
+      <w:r>
+        <w:t>…/privacy · …/terms · …/api/hmrc/callback</w:t>
       </w:r>
     </w:p>
     <w:p>
@@ -3509,10 +3509,10 @@
         <w:rPr>
           <w:b/>
         </w:rPr>
-        <w:t>Terms:</w:t>
-      </w:r>
-      <w:r>
-        <w:t xml:space="preserve"> https://spreadsheet-tax-production.up.railway.app/terms</w:t>
+        <w:t xml:space="preserve">Completed by: </w:t>
+      </w:r>
+      <w:r>
+        <w:t>Lee Hine</w:t>
       </w:r>
     </w:p>
     <w:p>
@@ -3520,10 +3520,10 @@
         <w:rPr>
           <w:b/>
         </w:rPr>
-        <w:t>Redirect URI:</w:t>
-      </w:r>
-      <w:r>
-        <w:t xml:space="preserve"> https://spreadsheet-tax-production.up.railway.app/api/hmrc/callback</w:t>
+        <w:t xml:space="preserve">Date of completion: </w:t>
+      </w:r>
+      <w:r>
+        <w:t>2026-07-17 (DRAFT — final date when actually sent)</w:t>
       </w:r>
     </w:p>
     <w:p>
@@ -3531,41 +3531,44 @@
         <w:rPr>
           <w:b/>
         </w:rPr>
-        <w:t>Completed by:</w:t>
-      </w:r>
-      <w:r>
-        <w:t xml:space="preserve"> Lee Hine</w:t>
+        <w:t xml:space="preserve">HMRC-recognised claimed? </w:t>
+      </w:r>
+      <w:r>
+        <w:t>NO</w:t>
       </w:r>
     </w:p>
+    <w:p/>
     <w:p>
       <w:r>
         <w:rPr>
           <w:b/>
         </w:rPr>
-        <w:t>Date:</w:t>
-      </w:r>
-      <w:r>
-        <w:t xml:space="preserve"> 2026-07-17</w:t>
+        <w:t>=== HOW HMRC REVIEW WORKS (reminder) ===</w:t>
       </w:r>
     </w:p>
+    <w:p>
+      <w:r>
+        <w:t>Return THIS form in HMRC format when ready. SDSTeam check checklist answers against sandbox API logs for Sandbox ID e6751be5-fd22-4447-9e77-aa51729b1b46 and fraud headers. Internal JSON packs are optional notes only — not a substitute for this form or real API traffic.</w:t>
+      </w:r>
+    </w:p>
+    <w:p/>
     <w:p>
       <w:r>
         <w:rPr>
           <w:b/>
         </w:rPr>
-        <w:t>HMRC-recognised claimed?</w:t>
-      </w:r>
-      <w:r>
-        <w:t xml:space="preserve"> NO</w:t>
+        <w:t>=== DRAFT ANSWERS (in-year target — confirm before send) ===</w:t>
       </w:r>
     </w:p>
-    <w:p/>
     <w:p>
       <w:r>
         <w:rPr>
           <w:b/>
         </w:rPr>
-        <w:t>—— GENERAL ——</w:t>
+        <w:t xml:space="preserve">Read Production access process in e2e guide: </w:t>
+      </w:r>
+      <w:r>
+        <w:t>Yes.</w:t>
       </w:r>
     </w:p>
     <w:p>
@@ -3573,10 +3576,10 @@
         <w:rPr>
           <w:b/>
         </w:rPr>
-        <w:t xml:space="preserve">Read Process for Production access in e2e guide: </w:t>
-      </w:r>
-      <w:r>
-        <w:t xml:space="preserve">Yes. </w:t>
+        <w:t xml:space="preserve">Testing meets service guide (via software): </w:t>
+      </w:r>
+      <w:r>
+        <w:t>Yes when complete. Must finish full operational in-year journey first</w:t>
       </w:r>
     </w:p>
     <w:p>
@@ -3584,13 +3587,10 @@
         <w:rPr>
           <w:b/>
         </w:rPr>
-        <w:t xml:space="preserve">Testing meets service guide requirements: </w:t>
-      </w:r>
-      <w:r>
-        <w:t xml:space="preserve">Yes. </w:t>
-      </w:r>
-      <w:r>
-        <w:t>Via software + Playwright, not only Postman</w:t>
+        <w:t xml:space="preserve">Fraud prevention headers on MTD calls: </w:t>
+      </w:r>
+      <w:r>
+        <w:t>Yes. WEB_APP_VIA_SERVER; honest omit unobtainable fields</w:t>
       </w:r>
     </w:p>
     <w:p>
@@ -3598,24 +3598,10 @@
         <w:rPr>
           <w:b/>
         </w:rPr>
-        <w:t xml:space="preserve">Fraud prevention headers on all MTD API calls: </w:t>
-      </w:r>
-      <w:r>
-        <w:t xml:space="preserve">Yes. </w:t>
-      </w:r>
-      <w:r>
-        <w:t>WEB_APP_VIA_SERVER; honest omit for unobtainable fields</w:t>
-      </w:r>
-    </w:p>
-    <w:p>
-      <w:r>
-        <w:rPr>
-          <w:b/>
-        </w:rPr>
-        <w:t xml:space="preserve">APIs called via software not only submission tool: </w:t>
-      </w:r>
-      <w:r>
-        <w:t xml:space="preserve">Yes. </w:t>
+        <w:t xml:space="preserve">APIs called via software not only tools: </w:t>
+      </w:r>
+      <w:r>
+        <w:t>Yes.</w:t>
       </w:r>
     </w:p>
     <w:p>
@@ -3626,10 +3612,7 @@
         <w:t xml:space="preserve">Customer owns/accesses/export records: </w:t>
       </w:r>
       <w:r>
-        <w:t xml:space="preserve">Yes. </w:t>
-      </w:r>
-      <w:r>
-        <w:t>Spreadsheet owns books; History export CSV for submissions</w:t>
+        <w:t>Yes. Spreadsheet + History CSV export</w:t>
       </w:r>
     </w:p>
     <w:p>
@@ -3637,10 +3620,10 @@
         <w:rPr>
           <w:b/>
         </w:rPr>
-        <w:t xml:space="preserve">Customer base Individuals: </w:t>
-      </w:r>
-      <w:r>
-        <w:t xml:space="preserve">Yes. </w:t>
+        <w:t xml:space="preserve">Individuals: </w:t>
+      </w:r>
+      <w:r>
+        <w:t>Yes.</w:t>
       </w:r>
     </w:p>
     <w:p>
@@ -3648,13 +3631,10 @@
         <w:rPr>
           <w:b/>
         </w:rPr>
-        <w:t xml:space="preserve">Customer base Agents: </w:t>
-      </w:r>
-      <w:r>
-        <w:t xml:space="preserve">No. </w:t>
-      </w:r>
-      <w:r>
-        <w:t>Individual OAuth path for this stage</w:t>
+        <w:t xml:space="preserve">Agents: </w:t>
+      </w:r>
+      <w:r>
+        <w:t>No. This stage</w:t>
       </w:r>
     </w:p>
     <w:p>
@@ -3665,7 +3645,7 @@
         <w:t xml:space="preserve">In-Year product only: </w:t>
       </w:r>
       <w:r>
-        <w:t xml:space="preserve">Yes. </w:t>
+        <w:t>Yes.</w:t>
       </w:r>
     </w:p>
     <w:p>
@@ -3673,10 +3653,10 @@
         <w:rPr>
           <w:b/>
         </w:rPr>
-        <w:t xml:space="preserve">End of Year product only: </w:t>
-      </w:r>
-      <w:r>
-        <w:t xml:space="preserve">No. </w:t>
+        <w:t xml:space="preserve">End of Year only: </w:t>
+      </w:r>
+      <w:r>
+        <w:t>No.</w:t>
       </w:r>
     </w:p>
     <w:p>
@@ -3684,10 +3664,10 @@
         <w:rPr>
           <w:b/>
         </w:rPr>
-        <w:t xml:space="preserve">Full End to End product: </w:t>
-      </w:r>
-      <w:r>
-        <w:t xml:space="preserve">No. </w:t>
+        <w:t xml:space="preserve">Full end-to-end: </w:t>
+      </w:r>
+      <w:r>
+        <w:t>No.</w:t>
       </w:r>
     </w:p>
     <w:p>
@@ -3698,10 +3678,7 @@
         <w:t xml:space="preserve">Building iteratively: </w:t>
       </w:r>
       <w:r>
-        <w:t xml:space="preserve">Yes. </w:t>
-      </w:r>
-      <w:r>
-        <w:t>Stage required: In-Year</w:t>
+        <w:t>Yes. Stage: In-Year</w:t>
       </w:r>
     </w:p>
     <w:p>
@@ -3709,13 +3686,10 @@
         <w:rPr>
           <w:b/>
         </w:rPr>
-        <w:t xml:space="preserve">Supports Self-Employment: </w:t>
-      </w:r>
-      <w:r>
-        <w:t xml:space="preserve">Yes. </w:t>
-      </w:r>
-      <w:r>
-        <w:t>SE Business MTD 5.0</w:t>
+        <w:t xml:space="preserve">Self-Employment: </w:t>
+      </w:r>
+      <w:r>
+        <w:t>Yes.</w:t>
       </w:r>
     </w:p>
     <w:p>
@@ -3723,13 +3697,10 @@
         <w:rPr>
           <w:b/>
         </w:rPr>
-        <w:t xml:space="preserve">Supports UK Property: </w:t>
-      </w:r>
-      <w:r>
-        <w:t xml:space="preserve">Yes. </w:t>
-      </w:r>
-      <w:r>
-        <w:t>Property Business MTD 6.0</w:t>
+        <w:t xml:space="preserve">UK Property: </w:t>
+      </w:r>
+      <w:r>
+        <w:t>Yes.</w:t>
       </w:r>
     </w:p>
     <w:p>
@@ -3737,13 +3708,10 @@
         <w:rPr>
           <w:b/>
         </w:rPr>
-        <w:t xml:space="preserve">Supports Foreign Property: </w:t>
-      </w:r>
-      <w:r>
-        <w:t xml:space="preserve">Yes. </w:t>
-      </w:r>
-      <w:r>
-        <w:t>Property Business MTD 6.0</w:t>
+        <w:t xml:space="preserve">Foreign Property: </w:t>
+      </w:r>
+      <w:r>
+        <w:t>Yes.</w:t>
       </w:r>
     </w:p>
     <w:p>
@@ -3754,7 +3722,7 @@
         <w:t xml:space="preserve">Standard quarterly: </w:t>
       </w:r>
       <w:r>
-        <w:t xml:space="preserve">Yes. </w:t>
+        <w:t>Yes.</w:t>
       </w:r>
     </w:p>
     <w:p>
@@ -3765,7 +3733,7 @@
         <w:t xml:space="preserve">Calendar quarterly: </w:t>
       </w:r>
       <w:r>
-        <w:t xml:space="preserve">No. </w:t>
+        <w:t>No.</w:t>
       </w:r>
     </w:p>
     <w:p>
@@ -3773,10 +3741,10 @@
         <w:rPr>
           <w:b/>
         </w:rPr>
-        <w:t xml:space="preserve">Cash accounting: </w:t>
-      </w:r>
-      <w:r>
-        <w:t xml:space="preserve">Yes. </w:t>
+        <w:t xml:space="preserve">Cash: </w:t>
+      </w:r>
+      <w:r>
+        <w:t>Yes.</w:t>
       </w:r>
     </w:p>
     <w:p>
@@ -3784,13 +3752,10 @@
         <w:rPr>
           <w:b/>
         </w:rPr>
-        <w:t xml:space="preserve">Accruals accounting: </w:t>
-      </w:r>
-      <w:r>
-        <w:t xml:space="preserve">No. </w:t>
-      </w:r>
-      <w:r>
-        <w:t>Not claimed</w:t>
+        <w:t xml:space="preserve">Accruals: </w:t>
+      </w:r>
+      <w:r>
+        <w:t>No. Not claimed</w:t>
       </w:r>
     </w:p>
     <w:p>
@@ -3798,13 +3763,10 @@
         <w:rPr>
           <w:b/>
         </w:rPr>
-        <w:t xml:space="preserve">Non-mandated income not supported stated + GOV.UK software link: </w:t>
-      </w:r>
-      <w:r>
-        <w:t xml:space="preserve">Yes. </w:t>
-      </w:r>
-      <w:r>
-        <w:t>On /app and /security</w:t>
+        <w:t xml:space="preserve">Non-mandated not supported + GOV.UK software link: </w:t>
+      </w:r>
+      <w:r>
+        <w:t>Yes. UI stated</w:t>
       </w:r>
     </w:p>
     <w:p>
@@ -3812,13 +3774,10 @@
         <w:rPr>
           <w:b/>
         </w:rPr>
-        <w:t xml:space="preserve">EOY/Final Declaration not supported stated + GOV.UK software link: </w:t>
-      </w:r>
-      <w:r>
-        <w:t xml:space="preserve">Yes. </w:t>
-      </w:r>
-      <w:r>
-        <w:t>On /app and /security</w:t>
+        <w:t xml:space="preserve">EOY not supported + GOV.UK software link: </w:t>
+      </w:r>
+      <w:r>
+        <w:t>Yes. UI stated</w:t>
       </w:r>
     </w:p>
     <w:p>
@@ -3826,13 +3785,10 @@
         <w:rPr>
           <w:b/>
         </w:rPr>
-        <w:t xml:space="preserve">Tax calc via Individual Calculations API in software: </w:t>
-      </w:r>
-      <w:r>
-        <w:t xml:space="preserve">No. </w:t>
-      </w:r>
-      <w:r>
-        <w:t>Not in-app</w:t>
+        <w:t xml:space="preserve">Tax calc via Individual Calculations in software: </w:t>
+      </w:r>
+      <w:r>
+        <w:t>No. Signpost HMRC account</w:t>
       </w:r>
     </w:p>
     <w:p>
@@ -3840,13 +3796,10 @@
         <w:rPr>
           <w:b/>
         </w:rPr>
-        <w:t xml:space="preserve">Signpost to HMRC account for calculation: </w:t>
-      </w:r>
-      <w:r>
-        <w:t xml:space="preserve">Yes. </w:t>
-      </w:r>
-      <w:r>
-        <w:t>/app link to HMRC online services</w:t>
+        <w:t xml:space="preserve">Signpost to HMRC for calculation: </w:t>
+      </w:r>
+      <w:r>
+        <w:t>Yes.</w:t>
       </w:r>
     </w:p>
     <w:p>
@@ -3854,10 +3807,10 @@
         <w:rPr>
           <w:b/>
         </w:rPr>
-        <w:t xml:space="preserve">Displays appropriate API error messages: </w:t>
-      </w:r>
-      <w:r>
-        <w:t xml:space="preserve">Yes. </w:t>
+        <w:t xml:space="preserve">Error messages displayed: </w:t>
+      </w:r>
+      <w:r>
+        <w:t>Yes.</w:t>
       </w:r>
     </w:p>
     <w:p>
@@ -3865,7 +3818,10 @@
         <w:rPr>
           <w:b/>
         </w:rPr>
-        <w:t>—— IN-YEAR ——</w:t>
+        <w:t xml:space="preserve">Business Details list/retrieve: </w:t>
+      </w:r>
+      <w:r>
+        <w:t>Yes. Must show in logs before send</w:t>
       </w:r>
     </w:p>
     <w:p>
@@ -3873,13 +3829,10 @@
         <w:rPr>
           <w:b/>
         </w:rPr>
-        <w:t xml:space="preserve">List/retrieve Business Details: </w:t>
-      </w:r>
-      <w:r>
-        <w:t xml:space="preserve">Yes. </w:t>
-      </w:r>
-      <w:r>
-        <w:t>Sandbox proven + UI Load businesses</w:t>
+        <w:t xml:space="preserve">I&amp;E Obligations retrieve: </w:t>
+      </w:r>
+      <w:r>
+        <w:t>Yes. Must show in logs before send</w:t>
       </w:r>
     </w:p>
     <w:p>
@@ -3887,13 +3840,10 @@
         <w:rPr>
           <w:b/>
         </w:rPr>
-        <w:t xml:space="preserve">Calendar quarterly period type endpoints: </w:t>
-      </w:r>
-      <w:r>
-        <w:t xml:space="preserve">No. </w:t>
-      </w:r>
-      <w:r>
-        <w:t>N/A</w:t>
+        <w:t xml:space="preserve">Submit from digital record no manual keying: </w:t>
+      </w:r>
+      <w:r>
+        <w:t>Yes. Server draft from spreadsheet</w:t>
       </w:r>
     </w:p>
     <w:p>
@@ -3901,13 +3851,10 @@
         <w:rPr>
           <w:b/>
         </w:rPr>
-        <w:t xml:space="preserve">Periods of Account in this in-year stage: </w:t>
-      </w:r>
-      <w:r>
-        <w:t xml:space="preserve">No. </w:t>
-      </w:r>
-      <w:r>
-        <w:t>N/A in-year only</w:t>
+        <w:t xml:space="preserve">SE and/or Property period submit/retrieve: </w:t>
+      </w:r>
+      <w:r>
+        <w:t>Yes when logs complete. SE proven once; property must be in logs too</w:t>
       </w:r>
     </w:p>
     <w:p>
@@ -3915,164 +3862,33 @@
         <w:rPr>
           <w:b/>
         </w:rPr>
-        <w:t xml:space="preserve">Retrieve I&amp;E Obligations: </w:t>
-      </w:r>
-      <w:r>
-        <w:t xml:space="preserve">Yes. </w:t>
-      </w:r>
-      <w:r>
-        <w:t>Obligations MTD 3.0 + UI</w:t>
+        <w:t xml:space="preserve">EOY section: </w:t>
+      </w:r>
+      <w:r>
+        <w:t>N/A. Not requesting EOY Production access</w:t>
       </w:r>
     </w:p>
+    <w:p/>
     <w:p>
       <w:r>
         <w:rPr>
           <w:b/>
         </w:rPr>
-        <w:t xml:space="preserve">Final Declaration obligations with I&amp;E: </w:t>
-      </w:r>
-      <w:r>
-        <w:t xml:space="preserve">No. </w:t>
-      </w:r>
-      <w:r>
-        <w:t>Not for in-year only</w:t>
+        <w:t>FPH missing data (for checklist comments):</w:t>
       </w:r>
     </w:p>
+    <w:p>
+      <w:r>
+        <w:t>Gov-Client-Public-Port omitted when PaaS does not expose client public TCP port (not invented). Multi-Factor omitted (password-only). Vendor public IP via VENDOR_PUBLIC_IP when set.</w:t>
+      </w:r>
+    </w:p>
+    <w:p/>
     <w:p>
       <w:r>
         <w:rPr>
           <w:b/>
         </w:rPr>
-        <w:t xml:space="preserve">Submit data from digital record — no manual keying on submit: </w:t>
-      </w:r>
-      <w:r>
-        <w:t xml:space="preserve">Yes. </w:t>
-      </w:r>
-      <w:r>
-        <w:t>draftId server-owned import</w:t>
-      </w:r>
-    </w:p>
-    <w:p>
-      <w:r>
-        <w:rPr>
-          <w:b/>
-        </w:rPr>
-        <w:t xml:space="preserve">Submit/retrieve in-year period summaries SE and/or property: </w:t>
-      </w:r>
-      <w:r>
-        <w:t xml:space="preserve">Yes. </w:t>
-      </w:r>
-      <w:r>
-        <w:t>SE sandbox 200 proven; property paths shipped</w:t>
-      </w:r>
-    </w:p>
-    <w:p>
-      <w:r>
-        <w:rPr>
-          <w:b/>
-        </w:rPr>
-        <w:t xml:space="preserve">Foreign property details CRUD: </w:t>
-      </w:r>
-      <w:r>
-        <w:t xml:space="preserve">No. </w:t>
-      </w:r>
-      <w:r>
-        <w:t>Period summary only this stage</w:t>
-      </w:r>
-    </w:p>
-    <w:p>
-      <w:r>
-        <w:rPr>
-          <w:b/>
-        </w:rPr>
-        <w:t xml:space="preserve">Annual Submission endpoints in this stage: </w:t>
-      </w:r>
-      <w:r>
-        <w:t xml:space="preserve">No. </w:t>
-      </w:r>
-    </w:p>
-    <w:p>
-      <w:r>
-        <w:rPr>
-          <w:b/>
-        </w:rPr>
-        <w:t xml:space="preserve">Individual Calculations trigger/list/retrieve in software: </w:t>
-      </w:r>
-      <w:r>
-        <w:t xml:space="preserve">No. </w:t>
-      </w:r>
-      <w:r>
-        <w:t>Signpost instead</w:t>
-      </w:r>
-    </w:p>
-    <w:p>
-      <w:r>
-        <w:rPr>
-          <w:b/>
-        </w:rPr>
-        <w:t xml:space="preserve">END OF YEAR section: </w:t>
-      </w:r>
-      <w:r>
-        <w:t xml:space="preserve">N/A. </w:t>
-      </w:r>
-      <w:r>
-        <w:t>Not requesting EOY production access on this return</w:t>
-      </w:r>
-    </w:p>
-    <w:p/>
-    <w:p>
-      <w:r>
-        <w:rPr>
-          <w:b/>
-        </w:rPr>
-        <w:t>Fraud prevention missing-data note:</w:t>
-      </w:r>
-    </w:p>
-    <w:p>
-      <w:r>
-        <w:t>WEB_APP_VIA_SERVER. Gov-Client-Public-Port omitted when PaaS proxy does not expose client public TCP port (cannot invent). Multi-Factor omitted (password-only). Vendor public IP from VENDOR_PUBLIC_IP env (Railway egress). Earlier invent-port experiment removed; honest-omit policy in code + tests.</w:t>
-      </w:r>
-    </w:p>
-    <w:p>
-      <w:r>
-        <w:rPr>
-          <w:b/>
-        </w:rPr>
-        <w:t>QuarterLink vs Spreadsheet Tax:</w:t>
-      </w:r>
-    </w:p>
-    <w:p>
-      <w:r>
-        <w:t>June 2026 SDSTeam pack / 2026-EPI962 / NINO TZ222092B / correlations were for product QuarterLink. Spreadsheet Tax is the current product. Please confirm whether the existing Production application can be renamed and re-pointed (privacy/terms/redirect) or a new Production application is required.</w:t>
-      </w:r>
-    </w:p>
-    <w:p/>
-    <w:p>
-      <w:r>
-        <w:rPr>
-          <w:b/>
-        </w:rPr>
-        <w:t>Before send — Lee must paste:</w:t>
-      </w:r>
-    </w:p>
-    <w:p>
-      <w:r>
-        <w:t>1) Sandbox Application ID from Developer Hub</w:t>
-      </w:r>
-    </w:p>
-    <w:p>
-      <w:r>
-        <w:t>2) Production Application ID from Developer Hub</w:t>
-      </w:r>
-    </w:p>
-    <w:p>
-      <w:r>
-        <w:t>3) Current sandbox test user NINO used for Spreadsheet Tax (Railway HMRC_SANDBOX_TEST_NINO)</w:t>
-      </w:r>
-    </w:p>
-    <w:p>
-      <w:r>
-        <w:t>4) Attach spreadsheet-tax-sandbox-evidence-pack.json</w:t>
+        <w:t>STATUS: DRAFT — DO NOT SEND until operational in-year software + fresh sandbox logs.</w:t>
       </w:r>
     </w:p>
     <w:sectPr>

</xml_diff>